<commit_message>
adjust some script to better everything for enemy and player
</commit_message>
<xml_diff>
--- a/bestanden/reflectiedocument.docx
+++ b/bestanden/reflectiedocument.docx
@@ -54,13 +54,6 @@
           <w:lang w:val="en-NL"/>
         </w:rPr>
       </w:pPr>
-    </w:p>
-    <w:p>
-      <w:pPr>
-        <w:rPr>
-          <w:lang w:val="en-NL"/>
-        </w:rPr>
-      </w:pPr>
       <w:r>
         <w:rPr>
           <w:lang w:val="en-NL"/>
@@ -87,13 +80,6 @@
           <w:lang w:val="en-NL"/>
         </w:rPr>
       </w:pPr>
-    </w:p>
-    <w:p>
-      <w:pPr>
-        <w:rPr>
-          <w:lang w:val="en-NL"/>
-        </w:rPr>
-      </w:pPr>
       <w:r>
         <w:rPr>
           <w:lang w:val="en-NL"/>
@@ -106,13 +92,6 @@
         </w:rPr>
         <w:t>4</w:t>
       </w:r>
-    </w:p>
-    <w:p>
-      <w:pPr>
-        <w:rPr>
-          <w:lang w:val="en-NL"/>
-        </w:rPr>
-      </w:pPr>
     </w:p>
     <w:p>
       <w:pPr>

</xml_diff>